<commit_message>
FGD Semana 3: referencias alineadas con los libros del sílabo (sin capítulos)
Co-Authored-By: Claude Sonnet 5.5 <noreply@anthropic.com>
Claude-Session: https://claude.ai/code/session_01Xscepqqq8h1ZeLgXfPcbDX
</commit_message>
<xml_diff>
--- a/fgd/semana03/LAB-D3-FGD-2026II-DOCENTE.docx
+++ b/fgd/semana03/LAB-D3-FGD-2026II-DOCENTE.docx
@@ -507,7 +507,7 @@
           <w:b w:val="0"/>
           <w:sz w:val="24"/>
         </w:rPr>
-        <w:t xml:space="preserve">Con carácter previo a la sesión, el estudiante deberá revisar las diapositivas de la Semana 3 (INNER JOIN, LEFT JOIN, RIGHT JOIN, FULL OUTER JOIN, GROUP BY, HAVING, subconsultas, vistas y buenas prácticas de alias, comentarios y legibilidad) y el Laboratorio Dirigido N.° 02, cuyas consultas básicas se retoman aquí. Referencias de consulta:</w:t>
+        <w:t xml:space="preserve">Con carácter previo a la sesión, el estudiante deberá revisar las diapositivas de la Semana 3 (INNER JOIN, LEFT JOIN, RIGHT JOIN, FULL OUTER JOIN, GROUP BY, HAVING, subconsultas, vistas y buenas prácticas de alias, comentarios y legibilidad) y el Laboratorio Dirigido N.° 02, cuyas consultas básicas se retoman aquí. Libros del sílabo para esta semana (se consultan los apartados sobre JOIN, GROUP BY y HAVING, subconsultas y vistas) y documentación de SQLite:</w:t>
       </w:r>
     </w:p>
     <w:p>
@@ -531,7 +531,7 @@
           <w:b w:val="0"/>
           <w:sz w:val="24"/>
         </w:rPr>
-        <w:t xml:space="preserve">Beaulieu, A. (2020). Learning SQL (3.ª ed.). O'Reilly Media. Capítulos 5, 8, 9 y 14.</w:t>
+        <w:t xml:space="preserve">Molinaro, A. y de Graaff, R. (2020). SQL Cookbook (2.ª ed.). O'Reilly Media.</w:t>
       </w:r>
     </w:p>
     <w:p>
@@ -555,7 +555,7 @@
           <w:b w:val="0"/>
           <w:sz w:val="24"/>
         </w:rPr>
-        <w:t xml:space="preserve">Silberschatz, A., Korth, H. F. y Sudarshan, S. (2020). Database System Concepts (7.ª ed.). McGraw-Hill. Capítulos 3 y 4.</w:t>
+        <w:t xml:space="preserve">Tanimura, C. (2021). SQL for Data Analysis. O'Reilly Media.</w:t>
       </w:r>
     </w:p>
     <w:p>

</xml_diff>